<commit_message>
JMEP cover letter: disclose earlier submission JMEP-26-07-50730 and request its withdrawal
</commit_message>
<xml_diff>
--- a/submissions/JMEP-2026-09/CoverLetter.docx
+++ b/submissions/JMEP-2026-09/CoverLetter.docx
@@ -271,7 +271,52 @@
         <w:pStyle w:val="BodyText"/>
       </w:pPr>
       <w:r>
-        <w:t xml:space="preserve">This manuscript is original, has not been published, and is not under consideration elsewhere.</w:t>
+        <w:t xml:space="preserve">An earlier version of this work,</w:t>
+      </w:r>
+      <w:r>
+        <w:t xml:space="preserve"> </w:t>
+      </w:r>
+      <w:r>
+        <w:rPr>
+          <w:i/>
+          <w:iCs/>
+        </w:rPr>
+        <w:t xml:space="preserve">Mechanical Responses of an AI-Hypothesized Super-elastic</w:t>
+      </w:r>
+      <w:r>
+        <w:rPr>
+          <w:i/>
+          <w:iCs/>
+        </w:rPr>
+        <w:t xml:space="preserve"> </w:t>
+      </w:r>
+      <w:r>
+        <w:rPr>
+          <w:i/>
+          <w:iCs/>
+        </w:rPr>
+        <w:t xml:space="preserve">Fe-Mn-Al-Ni-Si-C Alloy</w:t>
+      </w:r>
+      <w:r>
+        <w:t xml:space="preserve">, was submitted to the journal on 13 July 2026 as JMEP-26-07-50730; we did</w:t>
+      </w:r>
+      <w:r>
+        <w:t xml:space="preserve"> </w:t>
+      </w:r>
+      <w:r>
+        <w:t xml:space="preserve">not return its copyright transfer form. The present manuscript is a substantially revised version</w:t>
+      </w:r>
+      <w:r>
+        <w:t xml:space="preserve"> </w:t>
+      </w:r>
+      <w:r>
+        <w:t xml:space="preserve">that supersedes it, and we ask that JMEP-26-07-50730 be withdrawn. Apart from that earlier</w:t>
+      </w:r>
+      <w:r>
+        <w:t xml:space="preserve"> </w:t>
+      </w:r>
+      <w:r>
+        <w:t xml:space="preserve">version, this manuscript has not been published and is not under consideration elsewhere.</w:t>
       </w:r>
       <w:r>
         <w:t xml:space="preserve"> </w:t>
@@ -471,6 +516,9 @@
   <w:style w:default="1" w:styleId="Normal" w:type="paragraph">
     <w:name w:val="Normal"/>
     <w:qFormat/>
+    <w:rPr>
+      <w:rFonts w:ascii="Times New Roman" w:hAnsi="Times New Roman"/>
+    </w:rPr>
   </w:style>
   <w:style w:styleId="BodyText" w:type="paragraph">
     <w:name w:val="Body Text"/>
@@ -480,12 +528,18 @@
     <w:pPr>
       <w:spacing w:after="180" w:before="180"/>
     </w:pPr>
+    <w:rPr>
+      <w:rFonts w:ascii="Times New Roman" w:hAnsi="Times New Roman"/>
+    </w:rPr>
   </w:style>
   <w:style w:customStyle="1" w:styleId="FirstParagraph" w:type="paragraph">
     <w:name w:val="First Paragraph"/>
     <w:basedOn w:val="BodyText"/>
     <w:next w:val="BodyText"/>
     <w:qFormat/>
+    <w:rPr>
+      <w:rFonts w:ascii="Times New Roman" w:hAnsi="Times New Roman"/>
+    </w:rPr>
   </w:style>
   <w:style w:customStyle="1" w:styleId="Compact" w:type="paragraph">
     <w:name w:val="Compact"/>
@@ -494,6 +548,9 @@
     <w:pPr>
       <w:spacing w:after="36" w:before="36"/>
     </w:pPr>
+    <w:rPr>
+      <w:rFonts w:ascii="Times New Roman" w:hAnsi="Times New Roman"/>
+    </w:rPr>
   </w:style>
   <w:style w:styleId="Title" w:type="paragraph">
     <w:name w:val="Title"/>
@@ -509,7 +566,7 @@
       <w:jc w:val="center"/>
     </w:pPr>
     <w:rPr>
-      <w:rFonts w:asciiTheme="majorHAnsi" w:cstheme="majorBidi" w:eastAsiaTheme="majorEastAsia" w:hAnsiTheme="majorHAnsi"/>
+      <w:rFonts w:asciiTheme="majorHAnsi" w:cstheme="majorBidi" w:eastAsiaTheme="majorEastAsia" w:hAnsiTheme="majorHAnsi" w:ascii="Times New Roman" w:hAnsi="Times New Roman"/>
       <w:sz w:val="56"/>
       <w:szCs w:val="56"/>
     </w:rPr>
@@ -540,7 +597,7 @@
       </w:numPr>
     </w:pPr>
     <w:rPr>
-      <w:rFonts w:cstheme="majorBidi" w:eastAsiaTheme="majorEastAsia"/>
+      <w:rFonts w:cstheme="majorBidi" w:eastAsiaTheme="majorEastAsia" w:ascii="Times New Roman" w:hAnsi="Times New Roman"/>
       <w:spacing w:val="15"/>
       <w:sz w:val="28"/>
       <w:szCs w:val="28"/>
@@ -570,6 +627,7 @@
       <w:keepLines/>
     </w:pPr>
     <w:rPr>
+      <w:rFonts w:ascii="Times New Roman" w:hAnsi="Times New Roman"/>
       <w:sz w:val="24"/>
       <w:szCs w:val="24"/>
     </w:rPr>
@@ -584,6 +642,7 @@
       <w:keepLines/>
     </w:pPr>
     <w:rPr>
+      <w:rFonts w:ascii="Times New Roman" w:hAnsi="Times New Roman"/>
       <w:sz w:val="24"/>
       <w:szCs w:val="24"/>
     </w:rPr>
@@ -600,6 +659,7 @@
       <w:jc w:val="center"/>
     </w:pPr>
     <w:rPr>
+      <w:rFonts w:ascii="Times New Roman" w:hAnsi="Times New Roman"/>
       <w:b/>
       <w:sz w:val="20"/>
       <w:szCs w:val="20"/>
@@ -616,6 +676,7 @@
       <w:spacing w:after="300" w:before="100"/>
     </w:pPr>
     <w:rPr>
+      <w:rFonts w:ascii="Times New Roman" w:hAnsi="Times New Roman"/>
       <w:sz w:val="20"/>
       <w:szCs w:val="20"/>
     </w:rPr>
@@ -626,7 +687,9 @@
     <w:next w:val="Bibliography"/>
     <w:qFormat/>
     <w:pPr/>
-    <w:rPr/>
+    <w:rPr>
+      <w:rFonts w:ascii="Times New Roman" w:hAnsi="Times New Roman"/>
+    </w:rPr>
   </w:style>
   <w:style w:styleId="Heading1" w:type="paragraph">
     <w:name w:val="heading 1"/>
@@ -643,28 +706,210 @@
       <w:outlineLvl w:val="0"/>
     </w:pPr>
     <w:rPr>
+      <w:rFonts w:asciiTheme="majorHAnsi" w:cstheme="majorBidi" w:eastAsiaTheme="majorEastAsia" w:hAnsiTheme="majorHAnsi" w:ascii="Times New Roman" w:hAnsi="Times New Roman"/>
+      <w:color w:themeColor="accent1" w:themeShade="BF" w:val="0F4761"/>
+      <w:sz w:val="40"/>
+      <w:szCs w:val="40"/>
+    </w:rPr>
+  </w:style>
+  <w:style w:styleId="Heading2" w:type="paragraph">
+    <w:name w:val="heading 2"/>
+    <w:basedOn w:val="Normal"/>
+    <w:next w:val="BodyText"/>
+    <w:link w:val="Heading2Char"/>
+    <w:uiPriority w:val="9"/>
+    <w:semiHidden/>
+    <w:unhideWhenUsed/>
+    <w:qFormat/>
+    <w:rsid w:val="00A10FD9"/>
+    <w:pPr>
+      <w:keepNext/>
+      <w:keepLines/>
+      <w:spacing w:after="80" w:before="160"/>
+      <w:outlineLvl w:val="1"/>
+    </w:pPr>
+    <w:rPr>
+      <w:rFonts w:asciiTheme="majorHAnsi" w:cstheme="majorBidi" w:eastAsiaTheme="majorEastAsia" w:hAnsiTheme="majorHAnsi" w:ascii="Times New Roman" w:hAnsi="Times New Roman"/>
+      <w:color w:themeColor="accent1" w:themeShade="BF" w:val="0F4761"/>
+      <w:sz w:val="32"/>
+      <w:szCs w:val="32"/>
+    </w:rPr>
+  </w:style>
+  <w:style w:styleId="Heading3" w:type="paragraph">
+    <w:name w:val="heading 3"/>
+    <w:basedOn w:val="Normal"/>
+    <w:next w:val="BodyText"/>
+    <w:link w:val="Heading3Char"/>
+    <w:uiPriority w:val="9"/>
+    <w:semiHidden/>
+    <w:unhideWhenUsed/>
+    <w:qFormat/>
+    <w:rsid w:val="00A10FD9"/>
+    <w:pPr>
+      <w:keepNext/>
+      <w:keepLines/>
+      <w:spacing w:after="80" w:before="160"/>
+      <w:outlineLvl w:val="2"/>
+    </w:pPr>
+    <w:rPr>
+      <w:rFonts w:cstheme="majorBidi" w:eastAsiaTheme="majorEastAsia" w:ascii="Times New Roman" w:hAnsi="Times New Roman"/>
+      <w:color w:themeColor="accent1" w:themeShade="BF" w:val="0F4761"/>
+      <w:sz w:val="28"/>
+      <w:szCs w:val="28"/>
+    </w:rPr>
+  </w:style>
+  <w:style w:styleId="Heading4" w:type="paragraph">
+    <w:name w:val="heading 4"/>
+    <w:basedOn w:val="Normal"/>
+    <w:next w:val="BodyText"/>
+    <w:link w:val="Heading4Char"/>
+    <w:uiPriority w:val="9"/>
+    <w:semiHidden/>
+    <w:unhideWhenUsed/>
+    <w:qFormat/>
+    <w:rsid w:val="00A10FD9"/>
+    <w:pPr>
+      <w:keepNext/>
+      <w:keepLines/>
+      <w:spacing w:after="40" w:before="80"/>
+      <w:outlineLvl w:val="3"/>
+    </w:pPr>
+    <w:rPr>
+      <w:rFonts w:cstheme="majorBidi" w:eastAsiaTheme="majorEastAsia" w:ascii="Times New Roman" w:hAnsi="Times New Roman"/>
+      <w:i/>
+      <w:iCs/>
+      <w:color w:themeColor="accent1" w:themeShade="BF" w:val="0F4761"/>
+    </w:rPr>
+  </w:style>
+  <w:style w:styleId="Heading5" w:type="paragraph">
+    <w:name w:val="heading 5"/>
+    <w:basedOn w:val="Normal"/>
+    <w:next w:val="BodyText"/>
+    <w:link w:val="Heading5Char"/>
+    <w:uiPriority w:val="9"/>
+    <w:semiHidden/>
+    <w:unhideWhenUsed/>
+    <w:qFormat/>
+    <w:rsid w:val="00A10FD9"/>
+    <w:pPr>
+      <w:keepNext/>
+      <w:keepLines/>
+      <w:spacing w:after="40" w:before="80"/>
+      <w:outlineLvl w:val="4"/>
+    </w:pPr>
+    <w:rPr>
+      <w:rFonts w:cstheme="majorBidi" w:eastAsiaTheme="majorEastAsia" w:ascii="Times New Roman" w:hAnsi="Times New Roman"/>
+      <w:color w:themeColor="accent1" w:themeShade="BF" w:val="0F4761"/>
+    </w:rPr>
+  </w:style>
+  <w:style w:styleId="Heading6" w:type="paragraph">
+    <w:name w:val="heading 6"/>
+    <w:basedOn w:val="Normal"/>
+    <w:next w:val="BodyText"/>
+    <w:link w:val="Heading6Char"/>
+    <w:uiPriority w:val="9"/>
+    <w:semiHidden/>
+    <w:unhideWhenUsed/>
+    <w:qFormat/>
+    <w:rsid w:val="00A10FD9"/>
+    <w:pPr>
+      <w:keepNext/>
+      <w:keepLines/>
+      <w:spacing w:after="0" w:before="40"/>
+      <w:outlineLvl w:val="5"/>
+    </w:pPr>
+    <w:rPr>
+      <w:rFonts w:cstheme="majorBidi" w:eastAsiaTheme="majorEastAsia" w:ascii="Times New Roman" w:hAnsi="Times New Roman"/>
+      <w:i/>
+      <w:iCs/>
+      <w:color w:themeColor="text1" w:themeTint="A6" w:val="595959"/>
+    </w:rPr>
+  </w:style>
+  <w:style w:styleId="Heading7" w:type="paragraph">
+    <w:name w:val="heading 7"/>
+    <w:basedOn w:val="Normal"/>
+    <w:next w:val="BodyText"/>
+    <w:link w:val="Heading7Char"/>
+    <w:uiPriority w:val="9"/>
+    <w:semiHidden/>
+    <w:unhideWhenUsed/>
+    <w:qFormat/>
+    <w:rsid w:val="00A10FD9"/>
+    <w:pPr>
+      <w:keepNext/>
+      <w:keepLines/>
+      <w:spacing w:after="0" w:before="40"/>
+      <w:outlineLvl w:val="6"/>
+    </w:pPr>
+    <w:rPr>
+      <w:rFonts w:cstheme="majorBidi" w:eastAsiaTheme="majorEastAsia" w:ascii="Times New Roman" w:hAnsi="Times New Roman"/>
+      <w:color w:themeColor="text1" w:themeTint="A6" w:val="595959"/>
+    </w:rPr>
+  </w:style>
+  <w:style w:styleId="Heading8" w:type="paragraph">
+    <w:name w:val="heading 8"/>
+    <w:basedOn w:val="Normal"/>
+    <w:next w:val="BodyText"/>
+    <w:link w:val="Heading8Char"/>
+    <w:uiPriority w:val="9"/>
+    <w:semiHidden/>
+    <w:unhideWhenUsed/>
+    <w:qFormat/>
+    <w:rsid w:val="00A10FD9"/>
+    <w:pPr>
+      <w:keepNext/>
+      <w:keepLines/>
+      <w:spacing w:after="0"/>
+      <w:outlineLvl w:val="7"/>
+    </w:pPr>
+    <w:rPr>
+      <w:rFonts w:cstheme="majorBidi" w:eastAsiaTheme="majorEastAsia" w:ascii="Times New Roman" w:hAnsi="Times New Roman"/>
+      <w:i/>
+      <w:iCs/>
+      <w:color w:themeColor="text1" w:themeTint="D8" w:val="272727"/>
+    </w:rPr>
+  </w:style>
+  <w:style w:styleId="Heading9" w:type="paragraph">
+    <w:name w:val="heading 9"/>
+    <w:basedOn w:val="Normal"/>
+    <w:next w:val="BodyText"/>
+    <w:link w:val="Heading9Char"/>
+    <w:uiPriority w:val="9"/>
+    <w:semiHidden/>
+    <w:unhideWhenUsed/>
+    <w:qFormat/>
+    <w:rsid w:val="00A10FD9"/>
+    <w:pPr>
+      <w:keepNext/>
+      <w:keepLines/>
+      <w:spacing w:after="0"/>
+      <w:outlineLvl w:val="8"/>
+    </w:pPr>
+    <w:rPr>
+      <w:rFonts w:cstheme="majorBidi" w:eastAsiaTheme="majorEastAsia" w:ascii="Times New Roman" w:hAnsi="Times New Roman"/>
+      <w:color w:themeColor="text1" w:themeTint="D8" w:val="272727"/>
+    </w:rPr>
+  </w:style>
+  <w:style w:customStyle="1" w:styleId="Heading1Char" w:type="character">
+    <w:name w:val="Heading 1 Char"/>
+    <w:basedOn w:val="DefaultParagraphFont"/>
+    <w:link w:val="Heading1"/>
+    <w:uiPriority w:val="9"/>
+    <w:rsid w:val="00A10FD9"/>
+    <w:rPr>
       <w:rFonts w:asciiTheme="majorHAnsi" w:cstheme="majorBidi" w:eastAsiaTheme="majorEastAsia" w:hAnsiTheme="majorHAnsi"/>
       <w:color w:themeColor="accent1" w:themeShade="BF" w:val="0F4761"/>
       <w:sz w:val="40"/>
       <w:szCs w:val="40"/>
     </w:rPr>
   </w:style>
-  <w:style w:styleId="Heading2" w:type="paragraph">
-    <w:name w:val="heading 2"/>
-    <w:basedOn w:val="Normal"/>
-    <w:next w:val="BodyText"/>
-    <w:link w:val="Heading2Char"/>
+  <w:style w:customStyle="1" w:styleId="Heading2Char" w:type="character">
+    <w:name w:val="Heading 2 Char"/>
+    <w:basedOn w:val="DefaultParagraphFont"/>
+    <w:link w:val="Heading2"/>
     <w:uiPriority w:val="9"/>
     <w:semiHidden/>
-    <w:unhideWhenUsed/>
-    <w:qFormat/>
-    <w:rsid w:val="00A10FD9"/>
-    <w:pPr>
-      <w:keepNext/>
-      <w:keepLines/>
-      <w:spacing w:after="80" w:before="160"/>
-      <w:outlineLvl w:val="1"/>
-    </w:pPr>
+    <w:rsid w:val="00A10FD9"/>
     <w:rPr>
       <w:rFonts w:asciiTheme="majorHAnsi" w:cstheme="majorBidi" w:eastAsiaTheme="majorEastAsia" w:hAnsiTheme="majorHAnsi"/>
       <w:color w:themeColor="accent1" w:themeShade="BF" w:val="0F4761"/>
@@ -672,22 +917,13 @@
       <w:szCs w:val="32"/>
     </w:rPr>
   </w:style>
-  <w:style w:styleId="Heading3" w:type="paragraph">
-    <w:name w:val="heading 3"/>
-    <w:basedOn w:val="Normal"/>
-    <w:next w:val="BodyText"/>
-    <w:link w:val="Heading3Char"/>
+  <w:style w:customStyle="1" w:styleId="Heading3Char" w:type="character">
+    <w:name w:val="Heading 3 Char"/>
+    <w:basedOn w:val="DefaultParagraphFont"/>
+    <w:link w:val="Heading3"/>
     <w:uiPriority w:val="9"/>
     <w:semiHidden/>
-    <w:unhideWhenUsed/>
-    <w:qFormat/>
-    <w:rsid w:val="00A10FD9"/>
-    <w:pPr>
-      <w:keepNext/>
-      <w:keepLines/>
-      <w:spacing w:after="80" w:before="160"/>
-      <w:outlineLvl w:val="2"/>
-    </w:pPr>
+    <w:rsid w:val="00A10FD9"/>
     <w:rPr>
       <w:rFonts w:cstheme="majorBidi" w:eastAsiaTheme="majorEastAsia"/>
       <w:color w:themeColor="accent1" w:themeShade="BF" w:val="0F4761"/>
@@ -695,22 +931,13 @@
       <w:szCs w:val="28"/>
     </w:rPr>
   </w:style>
-  <w:style w:styleId="Heading4" w:type="paragraph">
-    <w:name w:val="heading 4"/>
-    <w:basedOn w:val="Normal"/>
-    <w:next w:val="BodyText"/>
-    <w:link w:val="Heading4Char"/>
+  <w:style w:customStyle="1" w:styleId="Heading4Char" w:type="character">
+    <w:name w:val="Heading 4 Char"/>
+    <w:basedOn w:val="DefaultParagraphFont"/>
+    <w:link w:val="Heading4"/>
     <w:uiPriority w:val="9"/>
     <w:semiHidden/>
-    <w:unhideWhenUsed/>
-    <w:qFormat/>
-    <w:rsid w:val="00A10FD9"/>
-    <w:pPr>
-      <w:keepNext/>
-      <w:keepLines/>
-      <w:spacing w:after="40" w:before="80"/>
-      <w:outlineLvl w:val="3"/>
-    </w:pPr>
+    <w:rsid w:val="00A10FD9"/>
     <w:rPr>
       <w:rFonts w:cstheme="majorBidi" w:eastAsiaTheme="majorEastAsia"/>
       <w:i/>
@@ -718,43 +945,25 @@
       <w:color w:themeColor="accent1" w:themeShade="BF" w:val="0F4761"/>
     </w:rPr>
   </w:style>
-  <w:style w:styleId="Heading5" w:type="paragraph">
-    <w:name w:val="heading 5"/>
-    <w:basedOn w:val="Normal"/>
-    <w:next w:val="BodyText"/>
-    <w:link w:val="Heading5Char"/>
+  <w:style w:customStyle="1" w:styleId="Heading5Char" w:type="character">
+    <w:name w:val="Heading 5 Char"/>
+    <w:basedOn w:val="DefaultParagraphFont"/>
+    <w:link w:val="Heading5"/>
     <w:uiPriority w:val="9"/>
     <w:semiHidden/>
-    <w:unhideWhenUsed/>
-    <w:qFormat/>
-    <w:rsid w:val="00A10FD9"/>
-    <w:pPr>
-      <w:keepNext/>
-      <w:keepLines/>
-      <w:spacing w:after="40" w:before="80"/>
-      <w:outlineLvl w:val="4"/>
-    </w:pPr>
+    <w:rsid w:val="00A10FD9"/>
     <w:rPr>
       <w:rFonts w:cstheme="majorBidi" w:eastAsiaTheme="majorEastAsia"/>
       <w:color w:themeColor="accent1" w:themeShade="BF" w:val="0F4761"/>
     </w:rPr>
   </w:style>
-  <w:style w:styleId="Heading6" w:type="paragraph">
-    <w:name w:val="heading 6"/>
-    <w:basedOn w:val="Normal"/>
-    <w:next w:val="BodyText"/>
-    <w:link w:val="Heading6Char"/>
+  <w:style w:customStyle="1" w:styleId="Heading6Char" w:type="character">
+    <w:name w:val="Heading 6 Char"/>
+    <w:basedOn w:val="DefaultParagraphFont"/>
+    <w:link w:val="Heading6"/>
     <w:uiPriority w:val="9"/>
     <w:semiHidden/>
-    <w:unhideWhenUsed/>
-    <w:qFormat/>
-    <w:rsid w:val="00A10FD9"/>
-    <w:pPr>
-      <w:keepNext/>
-      <w:keepLines/>
-      <w:spacing w:after="0" w:before="40"/>
-      <w:outlineLvl w:val="5"/>
-    </w:pPr>
+    <w:rsid w:val="00A10FD9"/>
     <w:rPr>
       <w:rFonts w:cstheme="majorBidi" w:eastAsiaTheme="majorEastAsia"/>
       <w:i/>
@@ -762,43 +971,25 @@
       <w:color w:themeColor="text1" w:themeTint="A6" w:val="595959"/>
     </w:rPr>
   </w:style>
-  <w:style w:styleId="Heading7" w:type="paragraph">
-    <w:name w:val="heading 7"/>
-    <w:basedOn w:val="Normal"/>
-    <w:next w:val="BodyText"/>
-    <w:link w:val="Heading7Char"/>
+  <w:style w:customStyle="1" w:styleId="Heading7Char" w:type="character">
+    <w:name w:val="Heading 7 Char"/>
+    <w:basedOn w:val="DefaultParagraphFont"/>
+    <w:link w:val="Heading7"/>
     <w:uiPriority w:val="9"/>
     <w:semiHidden/>
-    <w:unhideWhenUsed/>
-    <w:qFormat/>
-    <w:rsid w:val="00A10FD9"/>
-    <w:pPr>
-      <w:keepNext/>
-      <w:keepLines/>
-      <w:spacing w:after="0" w:before="40"/>
-      <w:outlineLvl w:val="6"/>
-    </w:pPr>
+    <w:rsid w:val="00A10FD9"/>
     <w:rPr>
       <w:rFonts w:cstheme="majorBidi" w:eastAsiaTheme="majorEastAsia"/>
       <w:color w:themeColor="text1" w:themeTint="A6" w:val="595959"/>
     </w:rPr>
   </w:style>
-  <w:style w:styleId="Heading8" w:type="paragraph">
-    <w:name w:val="heading 8"/>
-    <w:basedOn w:val="Normal"/>
-    <w:next w:val="BodyText"/>
-    <w:link w:val="Heading8Char"/>
+  <w:style w:customStyle="1" w:styleId="Heading8Char" w:type="character">
+    <w:name w:val="Heading 8 Char"/>
+    <w:basedOn w:val="DefaultParagraphFont"/>
+    <w:link w:val="Heading8"/>
     <w:uiPriority w:val="9"/>
     <w:semiHidden/>
-    <w:unhideWhenUsed/>
-    <w:qFormat/>
-    <w:rsid w:val="00A10FD9"/>
-    <w:pPr>
-      <w:keepNext/>
-      <w:keepLines/>
-      <w:spacing w:after="0"/>
-      <w:outlineLvl w:val="7"/>
-    </w:pPr>
+    <w:rsid w:val="00A10FD9"/>
     <w:rPr>
       <w:rFonts w:cstheme="majorBidi" w:eastAsiaTheme="majorEastAsia"/>
       <w:i/>
@@ -806,134 +997,6 @@
       <w:color w:themeColor="text1" w:themeTint="D8" w:val="272727"/>
     </w:rPr>
   </w:style>
-  <w:style w:styleId="Heading9" w:type="paragraph">
-    <w:name w:val="heading 9"/>
-    <w:basedOn w:val="Normal"/>
-    <w:next w:val="BodyText"/>
-    <w:link w:val="Heading9Char"/>
-    <w:uiPriority w:val="9"/>
-    <w:semiHidden/>
-    <w:unhideWhenUsed/>
-    <w:qFormat/>
-    <w:rsid w:val="00A10FD9"/>
-    <w:pPr>
-      <w:keepNext/>
-      <w:keepLines/>
-      <w:spacing w:after="0"/>
-      <w:outlineLvl w:val="8"/>
-    </w:pPr>
-    <w:rPr>
-      <w:rFonts w:cstheme="majorBidi" w:eastAsiaTheme="majorEastAsia"/>
-      <w:color w:themeColor="text1" w:themeTint="D8" w:val="272727"/>
-    </w:rPr>
-  </w:style>
-  <w:style w:customStyle="1" w:styleId="Heading1Char" w:type="character">
-    <w:name w:val="Heading 1 Char"/>
-    <w:basedOn w:val="DefaultParagraphFont"/>
-    <w:link w:val="Heading1"/>
-    <w:uiPriority w:val="9"/>
-    <w:rsid w:val="00A10FD9"/>
-    <w:rPr>
-      <w:rFonts w:asciiTheme="majorHAnsi" w:cstheme="majorBidi" w:eastAsiaTheme="majorEastAsia" w:hAnsiTheme="majorHAnsi"/>
-      <w:color w:themeColor="accent1" w:themeShade="BF" w:val="0F4761"/>
-      <w:sz w:val="40"/>
-      <w:szCs w:val="40"/>
-    </w:rPr>
-  </w:style>
-  <w:style w:customStyle="1" w:styleId="Heading2Char" w:type="character">
-    <w:name w:val="Heading 2 Char"/>
-    <w:basedOn w:val="DefaultParagraphFont"/>
-    <w:link w:val="Heading2"/>
-    <w:uiPriority w:val="9"/>
-    <w:semiHidden/>
-    <w:rsid w:val="00A10FD9"/>
-    <w:rPr>
-      <w:rFonts w:asciiTheme="majorHAnsi" w:cstheme="majorBidi" w:eastAsiaTheme="majorEastAsia" w:hAnsiTheme="majorHAnsi"/>
-      <w:color w:themeColor="accent1" w:themeShade="BF" w:val="0F4761"/>
-      <w:sz w:val="32"/>
-      <w:szCs w:val="32"/>
-    </w:rPr>
-  </w:style>
-  <w:style w:customStyle="1" w:styleId="Heading3Char" w:type="character">
-    <w:name w:val="Heading 3 Char"/>
-    <w:basedOn w:val="DefaultParagraphFont"/>
-    <w:link w:val="Heading3"/>
-    <w:uiPriority w:val="9"/>
-    <w:semiHidden/>
-    <w:rsid w:val="00A10FD9"/>
-    <w:rPr>
-      <w:rFonts w:cstheme="majorBidi" w:eastAsiaTheme="majorEastAsia"/>
-      <w:color w:themeColor="accent1" w:themeShade="BF" w:val="0F4761"/>
-      <w:sz w:val="28"/>
-      <w:szCs w:val="28"/>
-    </w:rPr>
-  </w:style>
-  <w:style w:customStyle="1" w:styleId="Heading4Char" w:type="character">
-    <w:name w:val="Heading 4 Char"/>
-    <w:basedOn w:val="DefaultParagraphFont"/>
-    <w:link w:val="Heading4"/>
-    <w:uiPriority w:val="9"/>
-    <w:semiHidden/>
-    <w:rsid w:val="00A10FD9"/>
-    <w:rPr>
-      <w:rFonts w:cstheme="majorBidi" w:eastAsiaTheme="majorEastAsia"/>
-      <w:i/>
-      <w:iCs/>
-      <w:color w:themeColor="accent1" w:themeShade="BF" w:val="0F4761"/>
-    </w:rPr>
-  </w:style>
-  <w:style w:customStyle="1" w:styleId="Heading5Char" w:type="character">
-    <w:name w:val="Heading 5 Char"/>
-    <w:basedOn w:val="DefaultParagraphFont"/>
-    <w:link w:val="Heading5"/>
-    <w:uiPriority w:val="9"/>
-    <w:semiHidden/>
-    <w:rsid w:val="00A10FD9"/>
-    <w:rPr>
-      <w:rFonts w:cstheme="majorBidi" w:eastAsiaTheme="majorEastAsia"/>
-      <w:color w:themeColor="accent1" w:themeShade="BF" w:val="0F4761"/>
-    </w:rPr>
-  </w:style>
-  <w:style w:customStyle="1" w:styleId="Heading6Char" w:type="character">
-    <w:name w:val="Heading 6 Char"/>
-    <w:basedOn w:val="DefaultParagraphFont"/>
-    <w:link w:val="Heading6"/>
-    <w:uiPriority w:val="9"/>
-    <w:semiHidden/>
-    <w:rsid w:val="00A10FD9"/>
-    <w:rPr>
-      <w:rFonts w:cstheme="majorBidi" w:eastAsiaTheme="majorEastAsia"/>
-      <w:i/>
-      <w:iCs/>
-      <w:color w:themeColor="text1" w:themeTint="A6" w:val="595959"/>
-    </w:rPr>
-  </w:style>
-  <w:style w:customStyle="1" w:styleId="Heading7Char" w:type="character">
-    <w:name w:val="Heading 7 Char"/>
-    <w:basedOn w:val="DefaultParagraphFont"/>
-    <w:link w:val="Heading7"/>
-    <w:uiPriority w:val="9"/>
-    <w:semiHidden/>
-    <w:rsid w:val="00A10FD9"/>
-    <w:rPr>
-      <w:rFonts w:cstheme="majorBidi" w:eastAsiaTheme="majorEastAsia"/>
-      <w:color w:themeColor="text1" w:themeTint="A6" w:val="595959"/>
-    </w:rPr>
-  </w:style>
-  <w:style w:customStyle="1" w:styleId="Heading8Char" w:type="character">
-    <w:name w:val="Heading 8 Char"/>
-    <w:basedOn w:val="DefaultParagraphFont"/>
-    <w:link w:val="Heading8"/>
-    <w:uiPriority w:val="9"/>
-    <w:semiHidden/>
-    <w:rsid w:val="00A10FD9"/>
-    <w:rPr>
-      <w:rFonts w:cstheme="majorBidi" w:eastAsiaTheme="majorEastAsia"/>
-      <w:i/>
-      <w:iCs/>
-      <w:color w:themeColor="text1" w:themeTint="D8" w:val="272727"/>
-    </w:rPr>
-  </w:style>
   <w:style w:customStyle="1" w:styleId="Heading9Char" w:type="character">
     <w:name w:val="Heading 9 Char"/>
     <w:basedOn w:val="DefaultParagraphFont"/>
@@ -957,6 +1020,9 @@
       <w:spacing w:after="100" w:before="100"/>
       <w:ind w:firstLine="0" w:left="480" w:right="480"/>
     </w:pPr>
+    <w:rPr>
+      <w:rFonts w:ascii="Times New Roman" w:hAnsi="Times New Roman"/>
+    </w:rPr>
   </w:style>
   <w:style w:styleId="FootnoteText" w:type="paragraph">
     <w:name w:val="Footnote Text"/>
@@ -965,6 +1031,9 @@
     <w:uiPriority w:val="9"/>
     <w:unhideWhenUsed/>
     <w:qFormat/>
+    <w:rPr>
+      <w:rFonts w:ascii="Times New Roman" w:hAnsi="Times New Roman"/>
+    </w:rPr>
   </w:style>
   <w:style w:styleId="FootnoteBlockText" w:type="paragraph">
     <w:name w:val="Footnote Block Text"/>
@@ -977,6 +1046,9 @@
       <w:spacing w:after="100" w:before="100"/>
       <w:ind w:firstLine="0" w:left="480" w:right="480"/>
     </w:pPr>
+    <w:rPr>
+      <w:rFonts w:ascii="Times New Roman" w:hAnsi="Times New Roman"/>
+    </w:rPr>
   </w:style>
   <w:style w:default="1" w:styleId="DefaultParagraphFont" w:type="character">
     <w:name w:val="Default Paragraph Font"/>
@@ -1017,12 +1089,16 @@
       <w:spacing w:after="0"/>
     </w:pPr>
     <w:rPr>
+      <w:rFonts w:ascii="Times New Roman" w:hAnsi="Times New Roman"/>
       <w:b/>
     </w:rPr>
   </w:style>
   <w:style w:customStyle="1" w:styleId="Definition" w:type="paragraph">
     <w:name w:val="Definition"/>
     <w:basedOn w:val="Normal"/>
+    <w:rPr>
+      <w:rFonts w:ascii="Times New Roman" w:hAnsi="Times New Roman"/>
+    </w:rPr>
   </w:style>
   <w:style w:styleId="Caption" w:type="paragraph">
     <w:name w:val="Caption"/>
@@ -1032,6 +1108,7 @@
       <w:spacing w:after="120" w:before="0"/>
     </w:pPr>
     <w:rPr>
+      <w:rFonts w:ascii="Times New Roman" w:hAnsi="Times New Roman"/>
       <w:i/>
     </w:rPr>
   </w:style>
@@ -1041,14 +1118,23 @@
     <w:pPr>
       <w:keepNext/>
     </w:pPr>
+    <w:rPr>
+      <w:rFonts w:ascii="Times New Roman" w:hAnsi="Times New Roman"/>
+    </w:rPr>
   </w:style>
   <w:style w:customStyle="1" w:styleId="ImageCaption" w:type="paragraph">
     <w:name w:val="Image Caption"/>
     <w:basedOn w:val="Caption"/>
+    <w:rPr>
+      <w:rFonts w:ascii="Times New Roman" w:hAnsi="Times New Roman"/>
+    </w:rPr>
   </w:style>
   <w:style w:customStyle="1" w:styleId="Figure" w:type="paragraph">
     <w:name w:val="Figure"/>
     <w:basedOn w:val="Normal"/>
+    <w:rPr>
+      <w:rFonts w:ascii="Times New Roman" w:hAnsi="Times New Roman"/>
+    </w:rPr>
   </w:style>
   <w:style w:customStyle="1" w:styleId="CaptionedFigure" w:type="paragraph">
     <w:name w:val="Captioned Figure"/>
@@ -1056,6 +1142,9 @@
     <w:pPr>
       <w:keepNext/>
     </w:pPr>
+    <w:rPr>
+      <w:rFonts w:ascii="Times New Roman" w:hAnsi="Times New Roman"/>
+    </w:rPr>
   </w:style>
   <w:style w:customStyle="1" w:styleId="BodyTextChar" w:type="character">
     <w:name w:val="Body Text Char"/>
@@ -1100,7 +1189,7 @@
       <w:outlineLvl w:val="9"/>
     </w:pPr>
     <w:rPr>
-      <w:rFonts w:asciiTheme="majorHAnsi" w:cstheme="majorBidi" w:eastAsiaTheme="majorEastAsia" w:hAnsiTheme="majorHAnsi"/>
+      <w:rFonts w:asciiTheme="majorHAnsi" w:cstheme="majorBidi" w:eastAsiaTheme="majorEastAsia" w:hAnsiTheme="majorHAnsi" w:ascii="Times New Roman" w:hAnsi="Times New Roman"/>
       <w:b w:val="0"/>
       <w:bCs w:val="0"/>
       <w:color w:themeColor="accent1" w:themeShade="BF" w:val="365F91"/>
@@ -1113,6 +1202,9 @@
     <w:pPr>
       <w:wordWrap w:val="off"/>
     </w:pPr>
+    <w:rPr>
+      <w:rFonts w:ascii="Times New Roman" w:hAnsi="Times New Roman"/>
+    </w:rPr>
   </w:style>
   <w:style w:type="character" w:customStyle="1" w:styleId="KeywordTok">
     <w:name w:val="KeywordTok"/>

</xml_diff>